<commit_message>
Fix primary cancer mismatch prescreening
</commit_message>
<xml_diff>
--- a/artifacts/TrialMatch_AI_Project_Documentation_Updated.docx
+++ b/artifacts/TrialMatch_AI_Project_Documentation_Updated.docx
@@ -437,7 +437,7 @@
               <w:jc w:val="right"/>
             </w:pPr>
             <w:r>
-              <w:t xml:space="preserve">145 passed</w:t>
+              <w:t xml:space="preserve">148 passed</w:t>
             </w:r>
           </w:p>
         </w:tc>
@@ -2987,6 +2987,28 @@
               <w:jc w:val="right"/>
             </w:pPr>
             <w:r>
+              <w:t xml:space="preserve">1</w:t>
+            </w:r>
+          </w:p>
+        </w:tc>
+        <w:tc>
+          <w:p>
+            <w:pPr>
+              <w:pStyle w:val="Compact"/>
+              <w:jc w:val="right"/>
+            </w:pPr>
+            <w:r>
+              <w:t xml:space="preserve">26</w:t>
+            </w:r>
+          </w:p>
+        </w:tc>
+        <w:tc>
+          <w:p>
+            <w:pPr>
+              <w:pStyle w:val="Compact"/>
+              <w:jc w:val="right"/>
+            </w:pPr>
+            <w:r>
               <w:t xml:space="preserve">0</w:t>
             </w:r>
           </w:p>
@@ -2995,37 +3017,92 @@
           <w:p>
             <w:pPr>
               <w:pStyle w:val="Compact"/>
-              <w:jc w:val="right"/>
-            </w:pPr>
-            <w:r>
-              <w:t xml:space="preserve">27</w:t>
-            </w:r>
-          </w:p>
-        </w:tc>
-        <w:tc>
-          <w:p>
-            <w:pPr>
-              <w:pStyle w:val="Compact"/>
-              <w:jc w:val="right"/>
-            </w:pPr>
-            <w:r>
-              <w:t xml:space="preserve">0</w:t>
-            </w:r>
-          </w:p>
-        </w:tc>
-        <w:tc>
-          <w:p>
-            <w:pPr>
-              <w:pStyle w:val="Compact"/>
               <w:jc w:val="left"/>
             </w:pPr>
             <w:r>
-              <w:t xml:space="preserve">Potential match - needs verification</w:t>
+              <w:t xml:space="preserve">Apparent exclusion - needs verification</w:t>
             </w:r>
           </w:p>
         </w:tc>
       </w:tr>
     </w:tbl>
+    <w:p>
+      <w:pPr>
+        <w:pStyle w:val="BodyText"/>
+      </w:pPr>
+      <w:r>
+        <w:t xml:space="preserve">The pancreatic distractor</w:t>
+      </w:r>
+      <w:r>
+        <w:t xml:space="preserve"> </w:t>
+      </w:r>
+      <w:r>
+        <w:rPr>
+          <w:rStyle w:val="VerbatimChar"/>
+        </w:rPr>
+        <w:t xml:space="preserve">NCT06782685</w:t>
+      </w:r>
+      <w:r>
+        <w:t xml:space="preserve"> </w:t>
+      </w:r>
+      <w:r>
+        <w:t xml:space="preserve">is not treated as a potential match</w:t>
+      </w:r>
+      <w:r>
+        <w:t xml:space="preserve"> </w:t>
+      </w:r>
+      <w:r>
+        <w:t xml:space="preserve">merely because its structured age and sex fields pass. Its inclusion criterion</w:t>
+      </w:r>
+      <w:r>
+        <w:t xml:space="preserve"> </w:t>
+      </w:r>
+      <w:r>
+        <w:t xml:space="preserve">requires pancreatic cancer, while the verified patient diagnosis is colorectal</w:t>
+      </w:r>
+      <w:r>
+        <w:t xml:space="preserve"> </w:t>
+      </w:r>
+      <w:r>
+        <w:t xml:space="preserve">cancer, so the narrow deterministic diagnosis rule returns</w:t>
+      </w:r>
+      <w:r>
+        <w:t xml:space="preserve"> </w:t>
+      </w:r>
+      <w:r>
+        <w:rPr>
+          <w:rStyle w:val="VerbatimChar"/>
+        </w:rPr>
+        <w:t xml:space="preserve">DOES_NOT_MEET</w:t>
+      </w:r>
+      <w:r>
+        <w:t xml:space="preserve">.</w:t>
+      </w:r>
+      <w:r>
+        <w:t xml:space="preserve"> </w:t>
+      </w:r>
+      <w:r>
+        <w:t xml:space="preserve">Across all 1,542 criteria, this rule flags four criteria, all in pancreatic</w:t>
+      </w:r>
+      <w:r>
+        <w:t xml:space="preserve"> </w:t>
+      </w:r>
+      <w:r>
+        <w:t xml:space="preserve">distractor trials and none in the 55 candidate-role trials. Cohort-specific,</w:t>
+      </w:r>
+      <w:r>
+        <w:t xml:space="preserve"> </w:t>
+      </w:r>
+      <w:r>
+        <w:t xml:space="preserve">metastasis, history, multi-cancer, and exception wording remain guarded against</w:t>
+      </w:r>
+      <w:r>
+        <w:t xml:space="preserve"> </w:t>
+      </w:r>
+      <w:r>
+        <w:t xml:space="preserve">false-positive diagnosis mismatches.</w:t>
+      </w:r>
+    </w:p>
     <w:p>
       <w:pPr>
         <w:pStyle w:val="BodyText"/>
@@ -4397,7 +4474,7 @@
         <w:pStyle w:val="FirstParagraph"/>
       </w:pPr>
       <w:r>
-        <w:t xml:space="preserve">The final test suite contains 145 passing tests. Coverage includes:</w:t>
+        <w:t xml:space="preserve">The final test suite contains 148 passing tests. Coverage includes:</w:t>
       </w:r>
     </w:p>
     <w:p>
@@ -4527,6 +4604,18 @@
       </w:pPr>
       <w:r>
         <w:t xml:space="preserve">Exclusion-criterion direction</w:t>
+      </w:r>
+    </w:p>
+    <w:p>
+      <w:pPr>
+        <w:numPr>
+          <w:ilvl w:val="0"/>
+          <w:numId w:val="1009"/>
+        </w:numPr>
+        <w:pStyle w:val="Compact"/>
+      </w:pPr>
+      <w:r>
+        <w:t xml:space="preserve">Primary-cancer diagnosis mismatch and false-positive guards</w:t>
       </w:r>
     </w:p>
     <w:p>
@@ -6747,7 +6836,7 @@
               <w:jc w:val="right"/>
             </w:pPr>
             <w:r>
-              <w:t xml:space="preserve">145 passed</w:t>
+              <w:t xml:space="preserve">148 passed</w:t>
             </w:r>
           </w:p>
         </w:tc>
@@ -7293,7 +7382,7 @@
               <w:jc w:val="right"/>
             </w:pPr>
             <w:r>
-              <w:t xml:space="preserve">145</w:t>
+              <w:t xml:space="preserve">148</w:t>
             </w:r>
           </w:p>
         </w:tc>

</xml_diff>